<commit_message>
docs: TS-COMM-01·TS-GUI-09 트러블슈팅 이슈 등록
</commit_message>
<xml_diff>
--- a/docs/troubleshooting/AURIX_MediRun_07_트러블슈팅_COMM.docx
+++ b/docs/troubleshooting/AURIX_MediRun_07_트러블슈팅_COMM.docx
@@ -2776,17 +2776,8 @@
             <w:vAlign w:val="center"/>
           </w:tcPr>
           <w:p>
-            <w:pPr>
-              <w:spacing w:after="0" w:before="0" w:line="260"/>
-            </w:pPr>
-            <w:r>
-              <w:rPr>
-                <w:rFonts w:ascii="맑은 고딕" w:cs="맑은 고딕" w:eastAsia="맑은 고딕" w:hAnsi="맑은 고딕"/>
-                <w:color w:val="3C3429"/>
-                <w:sz w:val="17"/>
-                <w:szCs w:val="17"/>
-              </w:rPr>
-              <w:t xml:space="preserve">(증상 한 줄)</w:t>
+            <w:r>
+              <w:t>무선(Wi-Fi) 카메라 영상이 원격제어 화면에서 간헐적으로 멈추거나 깨져 보임</w:t>
             </w:r>
           </w:p>
         </w:tc>
@@ -2808,18 +2799,8 @@
             <w:vAlign w:val="center"/>
           </w:tcPr>
           <w:p>
-            <w:pPr>
-              <w:spacing w:after="0" w:before="0" w:line="260"/>
-              <w:jc w:val="center"/>
-            </w:pPr>
-            <w:r>
-              <w:rPr>
-                <w:rFonts w:ascii="맑은 고딕" w:cs="맑은 고딕" w:eastAsia="맑은 고딕" w:hAnsi="맑은 고딕"/>
-                <w:color w:val="3C3429"/>
-                <w:sz w:val="17"/>
-                <w:szCs w:val="17"/>
-              </w:rPr>
-              <w:t xml:space="preserve">MAJOR</w:t>
+            <w:r>
+              <w:t>MAJOR</w:t>
             </w:r>
           </w:p>
         </w:tc>
@@ -2841,18 +2822,8 @@
             <w:vAlign w:val="center"/>
           </w:tcPr>
           <w:p>
-            <w:pPr>
-              <w:spacing w:after="0" w:before="0" w:line="260"/>
-              <w:jc w:val="center"/>
-            </w:pPr>
-            <w:r>
-              <w:rPr>
-                <w:rFonts w:ascii="맑은 고딕" w:cs="맑은 고딕" w:eastAsia="맑은 고딕" w:hAnsi="맑은 고딕"/>
-                <w:color w:val="3C3429"/>
-                <w:sz w:val="17"/>
-                <w:szCs w:val="17"/>
-              </w:rPr>
-              <w:t xml:space="preserve">OPEN</w:t>
+            <w:r>
+              <w:t>RESOLVED</w:t>
             </w:r>
           </w:p>
         </w:tc>
@@ -3433,17 +3404,8 @@
             <w:vAlign w:val="center"/>
           </w:tcPr>
           <w:p>
-            <w:pPr>
-              <w:spacing w:after="0" w:before="0" w:line="260"/>
-            </w:pPr>
-            <w:r>
-              <w:rPr>
-                <w:rFonts w:ascii="맑은 고딕" w:cs="맑은 고딕" w:eastAsia="맑은 고딕" w:hAnsi="맑은 고딕"/>
-                <w:color w:val="3C3429"/>
-                <w:sz w:val="17"/>
-                <w:szCs w:val="17"/>
-              </w:rPr>
-              <w:t xml:space="preserve">0 / 0 / 0</w:t>
+            <w:r>
+              <w:t>1 / 1 / 0</w:t>
             </w:r>
           </w:p>
         </w:tc>
@@ -3501,17 +3463,8 @@
             <w:vAlign w:val="center"/>
           </w:tcPr>
           <w:p>
-            <w:pPr>
-              <w:spacing w:after="0" w:before="0" w:line="260"/>
-            </w:pPr>
-            <w:r>
-              <w:rPr>
-                <w:rFonts w:ascii="맑은 고딕" w:cs="맑은 고딕" w:eastAsia="맑은 고딕" w:hAnsi="맑은 고딕"/>
-                <w:color w:val="3C3429"/>
-                <w:sz w:val="17"/>
-                <w:szCs w:val="17"/>
-              </w:rPr>
-              <w:t xml:space="preserve">0</w:t>
+            <w:r>
+              <w:t>0</w:t>
             </w:r>
           </w:p>
         </w:tc>
@@ -3603,7 +3556,7 @@
           <w:sz w:val="26"/>
           <w:szCs w:val="26"/>
         </w:rPr>
-        <w:t xml:space="preserve">4.1 TS-COMM-01 (증상 제목을 여기에)</w:t>
+        <w:t>4.1 TS-COMM-01 (무선 카메라 영상 전송 시 화면 멈춤·깨짐 — CycloneDDS UDP 프로파일로 전환)</w:t>
       </w:r>
     </w:p>
     <w:p>
@@ -3765,17 +3718,8 @@
             <w:vAlign w:val="center"/>
           </w:tcPr>
           <w:p>
-            <w:pPr>
-              <w:spacing w:after="0" w:before="0" w:line="260"/>
-            </w:pPr>
-            <w:r>
-              <w:rPr>
-                <w:rFonts w:ascii="맑은 고딕" w:cs="맑은 고딕" w:eastAsia="맑은 고딕" w:hAnsi="맑은 고딕"/>
-                <w:color w:val="3C3429"/>
-                <w:sz w:val="17"/>
-                <w:szCs w:val="17"/>
-              </w:rPr>
-              <w:t xml:space="preserve">MAJOR / OPEN</w:t>
+            <w:r>
+              <w:t>MAJOR / RESOLVED</w:t>
             </w:r>
           </w:p>
         </w:tc>
@@ -3833,17 +3777,8 @@
             <w:vAlign w:val="center"/>
           </w:tcPr>
           <w:p>
-            <w:pPr>
-              <w:spacing w:after="0" w:before="0" w:line="260"/>
-            </w:pPr>
-            <w:r>
-              <w:rPr>
-                <w:rFonts w:ascii="맑은 고딕" w:cs="맑은 고딕" w:eastAsia="맑은 고딕" w:hAnsi="맑은 고딕"/>
-                <w:color w:val="3C3429"/>
-                <w:sz w:val="17"/>
-                <w:szCs w:val="17"/>
-              </w:rPr>
-              <w:t xml:space="preserve">2026-00-00 / 2026-00-00</w:t>
+            <w:r>
+              <w:t>2026-08-17 / 2026-08-17</w:t>
             </w:r>
           </w:p>
         </w:tc>
@@ -3899,17 +3834,8 @@
             <w:vAlign w:val="center"/>
           </w:tcPr>
           <w:p>
-            <w:pPr>
-              <w:spacing w:after="0" w:before="0" w:line="260"/>
-            </w:pPr>
-            <w:r>
-              <w:rPr>
-                <w:rFonts w:ascii="맑은 고딕" w:cs="맑은 고딕" w:eastAsia="맑은 고딕" w:hAnsi="맑은 고딕"/>
-                <w:color w:val="3C3429"/>
-                <w:sz w:val="17"/>
-                <w:szCs w:val="17"/>
-              </w:rPr>
-              <w:t xml:space="preserve">이름</w:t>
+            <w:r>
+              <w:t>COMM 담당</w:t>
             </w:r>
           </w:p>
         </w:tc>
@@ -3967,17 +3893,8 @@
             <w:vAlign w:val="center"/>
           </w:tcPr>
           <w:p>
-            <w:pPr>
-              <w:spacing w:after="0" w:before="0" w:line="260"/>
-            </w:pPr>
-            <w:r>
-              <w:rPr>
-                <w:rFonts w:ascii="맑은 고딕" w:cs="맑은 고딕" w:eastAsia="맑은 고딕" w:hAnsi="맑은 고딕"/>
-                <w:color w:val="3C3429"/>
-                <w:sz w:val="17"/>
-                <w:szCs w:val="17"/>
-              </w:rPr>
-              <w:t xml:space="preserve">ROS 2 Humble · VM(hj) / Pi(aurix) · 패키지명 · 커밋 해시</w:t>
+            <w:r>
+              <w:t>ROS 2 Humble · rmw_cyclonedds_cpp · TurtleBot3 Wi-Fi 무선망 · turtlebot3_bringup(Pi 측) · medirun_gui/medirun_bringup(PC 측)</w:t>
             </w:r>
           </w:p>
         </w:tc>
@@ -4033,17 +3950,8 @@
             <w:vAlign w:val="center"/>
           </w:tcPr>
           <w:p>
-            <w:pPr>
-              <w:spacing w:after="0" w:before="0" w:line="260"/>
-            </w:pPr>
-            <w:r>
-              <w:rPr>
-                <w:rFonts w:ascii="맑은 고딕" w:cs="맑은 고딕" w:eastAsia="맑은 고딕" w:hAnsi="맑은 고딕"/>
-                <w:color w:val="3C3429"/>
-                <w:sz w:val="17"/>
-                <w:szCs w:val="17"/>
-              </w:rPr>
-              <w:t xml:space="preserve">연관 이슈 ID, 커밋, 문서 절</w:t>
+            <w:r>
+              <w:t>TS-GUI-09(같은 세션에서 파생된 녹화 fps 이슈) / turtlebot3_bringup/config/cyclonedds_udp.xml, camera.launch.py, bringup.launch.py, roscamerafeedprovider.cpp·h (커밋 전, 작업 브랜치)</w:t>
             </w:r>
           </w:p>
         </w:tc>
@@ -4077,7 +3985,7 @@
           <w:sz w:val="17"/>
           <w:szCs w:val="17"/>
         </w:rPr>
-        <w:t xml:space="preserve">관측된 현상만 적는다. 로그 메시지나 수치가 있으면 그대로 옮긴다.</w:t>
+        <w:t>무선(Wi-Fi)으로 연결된 로봇의 카메라 영상이 원격제어 화면에서 간헐적으로 멈추거나 블록 형태로 깨져 보인다는 보고가 있었다. 정량 로그는 남아있지 않다 — 이 카드는 조치가 이미 반영된 시점에 작성되었다.</w:t>
       </w:r>
     </w:p>
     <w:tbl>
@@ -4114,31 +4022,10 @@
             </w:tcMar>
           </w:tcPr>
           <w:p>
-            <w:pPr>
-              <w:spacing w:after="20" w:line="240"/>
-            </w:pPr>
-            <w:r>
-              <w:rPr>
-                <w:rFonts w:ascii="Consolas" w:cs="Consolas" w:eastAsia="Consolas" w:hAnsi="Consolas"/>
-                <w:color w:val="3C3429"/>
-                <w:sz w:val="16"/>
-                <w:szCs w:val="16"/>
-              </w:rPr>
-              <w:t xml:space="preserve">$ 명령어</w:t>
-            </w:r>
-          </w:p>
-          <w:p>
-            <w:pPr>
-              <w:spacing w:after="20" w:line="240"/>
-            </w:pPr>
-            <w:r>
-              <w:rPr>
-                <w:rFonts w:ascii="Consolas" w:cs="Consolas" w:eastAsia="Consolas" w:hAnsi="Consolas"/>
-                <w:color w:val="3C3429"/>
-                <w:sz w:val="16"/>
-                <w:szCs w:val="16"/>
-              </w:rPr>
-              <w:t xml:space="preserve">출력 또는 에러 메시지</w:t>
+            <w:r>
+              <w:t>$ (조치 이전 상태의 정량 로그는 남아있지 않음 — 사용자 보고에 근거)</w:t>
+              <w:br/>
+              <w:t>원격제어 화면에서 카메라 영상이 간헐적으로 멈추거나 블록 형태로 깨져 보였다는 보고</w:t>
             </w:r>
           </w:p>
         </w:tc>
@@ -4307,17 +4194,8 @@
             <w:vAlign w:val="center"/>
           </w:tcPr>
           <w:p>
-            <w:pPr>
-              <w:spacing w:after="0" w:before="0" w:line="260"/>
-            </w:pPr>
-            <w:r>
-              <w:rPr>
-                <w:rFonts w:ascii="맑은 고딕" w:cs="맑은 고딕" w:eastAsia="맑은 고딕" w:hAnsi="맑은 고딕"/>
-                <w:color w:val="3C3429"/>
-                <w:sz w:val="17"/>
-                <w:szCs w:val="17"/>
-              </w:rPr>
-              <w:t xml:space="preserve">1</w:t>
+            <w:r>
+              <w:t>1</w:t>
             </w:r>
           </w:p>
         </w:tc>
@@ -4339,9 +4217,9 @@
             <w:vAlign w:val="center"/>
           </w:tcPr>
           <w:p>
-            <w:pPr>
-              <w:spacing w:after="0" w:before="0" w:line="260"/>
-            </w:pPr>
+            <w:r>
+              <w:t>cyclonedds_udp.xml 적용 후 로봇-GUI를 Wi-Fi로 연결해 원격제어 화면에서 카메라 영상을 관찰</w:t>
+            </w:r>
           </w:p>
         </w:tc>
         <w:tc>
@@ -4362,9 +4240,9 @@
             <w:vAlign w:val="center"/>
           </w:tcPr>
           <w:p>
-            <w:pPr>
-              <w:spacing w:after="0" w:before="0" w:line="260"/>
-            </w:pPr>
+            <w:r>
+              <w:t>ros2 topic hz 기준 약 30Hz, ros2 topic bw 기준 약 1.23MB/s로 안정 수신, 화면 확대 캡처에서 블록 깨짐·색 번짐 없음</w:t>
+            </w:r>
           </w:p>
         </w:tc>
       </w:tr>
@@ -4388,17 +4266,8 @@
             <w:vAlign w:val="center"/>
           </w:tcPr>
           <w:p>
-            <w:pPr>
-              <w:spacing w:after="0" w:before="0" w:line="260"/>
-            </w:pPr>
-            <w:r>
-              <w:rPr>
-                <w:rFonts w:ascii="맑은 고딕" w:cs="맑은 고딕" w:eastAsia="맑은 고딕" w:hAnsi="맑은 고딕"/>
-                <w:color w:val="3C3429"/>
-                <w:sz w:val="17"/>
-                <w:szCs w:val="17"/>
-              </w:rPr>
-              <w:t xml:space="preserve">2</w:t>
+            <w:r>
+              <w:t>2</w:t>
             </w:r>
           </w:p>
         </w:tc>
@@ -4421,9 +4290,9 @@
             <w:vAlign w:val="center"/>
           </w:tcPr>
           <w:p>
-            <w:pPr>
-              <w:spacing w:after="0" w:before="0" w:line="260"/>
-            </w:pPr>
+            <w:r>
+              <w:t>GUI 프로세스의 environ을 조회해 RMW_IMPLEMENTATION·CYCLONEDDS_URI가 실제로 주입됐는지 확인</w:t>
+            </w:r>
           </w:p>
         </w:tc>
         <w:tc>
@@ -4445,9 +4314,9 @@
             <w:vAlign w:val="center"/>
           </w:tcPr>
           <w:p>
-            <w:pPr>
-              <w:spacing w:after="0" w:before="0" w:line="260"/>
-            </w:pPr>
+            <w:r>
+              <w:t>두 값 모두 새 cyclonedds_udp.xml 경로로 정상 주입된 것을 확인</w:t>
+            </w:r>
           </w:p>
         </w:tc>
       </w:tr>
@@ -4470,17 +4339,8 @@
             <w:vAlign w:val="center"/>
           </w:tcPr>
           <w:p>
-            <w:pPr>
-              <w:spacing w:after="0" w:before="0" w:line="260"/>
-            </w:pPr>
-            <w:r>
-              <w:rPr>
-                <w:rFonts w:ascii="맑은 고딕" w:cs="맑은 고딕" w:eastAsia="맑은 고딕" w:hAnsi="맑은 고딕"/>
-                <w:color w:val="3C3429"/>
-                <w:sz w:val="17"/>
-                <w:szCs w:val="17"/>
-              </w:rPr>
-              <w:t xml:space="preserve">3</w:t>
+            <w:r>
+              <w:t>3</w:t>
             </w:r>
           </w:p>
         </w:tc>
@@ -4502,9 +4362,9 @@
             <w:vAlign w:val="center"/>
           </w:tcPr>
           <w:p>
-            <w:pPr>
-              <w:spacing w:after="0" w:before="0" w:line="260"/>
-            </w:pPr>
+            <w:r>
+              <w:t>(조치 이전 상태 재현 시도)</w:t>
+            </w:r>
           </w:p>
         </w:tc>
         <w:tc>
@@ -4525,9 +4385,9 @@
             <w:vAlign w:val="center"/>
           </w:tcPr>
           <w:p>
-            <w:pPr>
-              <w:spacing w:after="0" w:before="0" w:line="260"/>
-            </w:pPr>
+            <w:r>
+              <w:t>하지 않음 — 이미 조치가 적용된 뒤 세션에 합류해 이전 상태의 정량 로그는 없음</w:t>
+            </w:r>
           </w:p>
         </w:tc>
       </w:tr>
@@ -4543,7 +4403,7 @@
           <w:sz w:val="17"/>
           <w:szCs w:val="17"/>
         </w:rPr>
-        <w:t xml:space="preserve">재현율: n/m 회. 간헐적이면 반드시 명시한다.</w:t>
+        <w:t>해당 없음 — 조치 이후 상태만 직접 관측함. 조치 이전 화면 깨짐·멈춤은 이전 세션·사용자 보고에 근거.</w:t>
       </w:r>
     </w:p>
     <w:p>
@@ -4709,9 +4569,9 @@
             <w:vAlign w:val="center"/>
           </w:tcPr>
           <w:p>
-            <w:pPr>
-              <w:spacing w:after="0" w:before="0" w:line="260"/>
-            </w:pPr>
+            <w:r>
+              <w:t>카메라 자체 하드웨어·코덱 문제로 화질이 저하된 것</w:t>
+            </w:r>
           </w:p>
         </w:tc>
         <w:tc>
@@ -4732,9 +4592,9 @@
             <w:vAlign w:val="center"/>
           </w:tcPr>
           <w:p>
-            <w:pPr>
-              <w:spacing w:after="0" w:before="0" w:line="260"/>
-            </w:pPr>
+            <w:r>
+              <w:t>동일 네트워크에서 유선 대비 무선 전송 조건만 비교 검토</w:t>
+            </w:r>
           </w:p>
         </w:tc>
         <w:tc>
@@ -4755,17 +4615,8 @@
             <w:vAlign w:val="center"/>
           </w:tcPr>
           <w:p>
-            <w:pPr>
-              <w:spacing w:after="0" w:before="0" w:line="260"/>
-            </w:pPr>
-            <w:r>
-              <w:rPr>
-                <w:rFonts w:ascii="맑은 고딕" w:cs="맑은 고딕" w:eastAsia="맑은 고딕" w:hAnsi="맑은 고딕"/>
-                <w:color w:val="3C3429"/>
-                <w:sz w:val="17"/>
-                <w:szCs w:val="17"/>
-              </w:rPr>
-              <w:t xml:space="preserve">아님 — 근거</w:t>
+            <w:r>
+              <w:t>아님 — 문제는 전송 경로(Wi-Fi 상의 DDS 조각화·유실)에 국한되고 카메라 자체 인코딩 문제는 아니었음</w:t>
             </w:r>
           </w:p>
         </w:tc>
@@ -4790,9 +4641,9 @@
             <w:vAlign w:val="center"/>
           </w:tcPr>
           <w:p>
-            <w:pPr>
-              <w:spacing w:after="0" w:before="0" w:line="260"/>
-            </w:pPr>
+            <w:r>
+              <w:t>이미지처럼 큰 DDS 메시지가 Wi-Fi MTU보다 큰 조각으로 나뉘어 전송되어, 조각 하나만 유실돼도 프레임 전체가 깨지거나(BEST_EFFORT) 재전송을 기다리며 멈춘다(RELIABLE)</w:t>
+            </w:r>
           </w:p>
         </w:tc>
         <w:tc>
@@ -4814,9 +4665,9 @@
             <w:vAlign w:val="center"/>
           </w:tcPr>
           <w:p>
-            <w:pPr>
-              <w:spacing w:after="0" w:before="0" w:line="260"/>
-            </w:pPr>
+            <w:r>
+              <w:t>CycloneDDS 공식 설정 문서 기준 UDP 전송·MTU·조각화 동작 검토, 조치 후 실제 로봇으로 30Hz·1.23MB/s 안정 수신 및 화면 확대 캡처로 깨짐 없음 확인</w:t>
+            </w:r>
           </w:p>
         </w:tc>
         <w:tc>
@@ -4838,17 +4689,8 @@
             <w:vAlign w:val="center"/>
           </w:tcPr>
           <w:p>
-            <w:pPr>
-              <w:spacing w:after="0" w:before="0" w:line="260"/>
-            </w:pPr>
-            <w:r>
-              <w:rPr>
-                <w:rFonts w:ascii="맑은 고딕" w:cs="맑은 고딕" w:eastAsia="맑은 고딕" w:hAnsi="맑은 고딕"/>
-                <w:color w:val="3C3429"/>
-                <w:sz w:val="17"/>
-                <w:szCs w:val="17"/>
-              </w:rPr>
-              <w:t xml:space="preserve">맞음 — 근거</w:t>
+            <w:r>
+              <w:t>맞음 — 조치(UDP 강제, MTU 이하 조각 크기, 유니캐스트, BEST_EFFORT+depth1) 후 실측에서 유실·정체·깨짐 없이 안정 동작</w:t>
             </w:r>
           </w:p>
         </w:tc>
@@ -4882,7 +4724,7 @@
           <w:sz w:val="17"/>
           <w:szCs w:val="17"/>
         </w:rPr>
-        <w:t xml:space="preserve">확인된 근본 원인을 한 문단으로 적는다. 확인하지 못했으면 "미확인"이라고 쓰고 어디까지 좁혔는지 남긴다.</w:t>
+        <w:t>확인됨(설계 근거 기반). CycloneDDS 기본 전송 설정으로는 이미지처럼 큰 메시지가 Wi-Fi의 실제 MTU(약 1500B)보다 큰 조각으로 분할되어 전송된다. Wi-Fi는 유선보다 손실률이 높아 조각 중 하나만 유실돼도 그 프레임 전체가 무효가 되며, RELIABLE이면 재전송을 기다리며 화면이 멈추고 BEST_EFFORT면 손실 프레임을 버려 깨짐·티어링으로 보인다. 이 카드는 이미 조치가 반영된 시점에 작성되어, 조치 이전 상태에 대한 정량적 before/after 비교는 남아있지 않다.</w:t>
       </w:r>
     </w:p>
     <w:p>
@@ -5048,17 +4890,8 @@
             <w:vAlign w:val="center"/>
           </w:tcPr>
           <w:p>
-            <w:pPr>
-              <w:spacing w:after="0" w:before="0" w:line="260"/>
-            </w:pPr>
-            <w:r>
-              <w:rPr>
-                <w:rFonts w:ascii="맑은 고딕" w:cs="맑은 고딕" w:eastAsia="맑은 고딕" w:hAnsi="맑은 고딕"/>
-                <w:color w:val="3C3429"/>
-                <w:sz w:val="17"/>
-                <w:szCs w:val="17"/>
-              </w:rPr>
-              <w:t xml:space="preserve">파일 / 파라미터</w:t>
+            <w:r>
+              <w:t>turtlebot3_bringup/config/cyclonedds_udp.xml(신규) + camera.launch.py · bringup.launch.py</w:t>
             </w:r>
           </w:p>
         </w:tc>
@@ -5080,9 +4913,9 @@
             <w:vAlign w:val="center"/>
           </w:tcPr>
           <w:p>
-            <w:pPr>
-              <w:spacing w:after="0" w:before="0" w:line="260"/>
-            </w:pPr>
+            <w:r>
+              <w:t>CycloneDDS 기본 설정(전송 경로·조각 크기 미지정)</w:t>
+            </w:r>
           </w:p>
         </w:tc>
         <w:tc>
@@ -5103,9 +4936,41 @@
             <w:vAlign w:val="center"/>
           </w:tcPr>
           <w:p>
-            <w:pPr>
-              <w:spacing w:after="0" w:before="0" w:line="260"/>
-            </w:pPr>
+            <w:r>
+              <w:t>UDP/IPv4 강제, MaxMessageSize 1400B·FragmentSize 1344B로 MTU 이하 유지, AllowMulticast=spdp(카메라 데이터는 유니캐스트); RMW_IMPLEMENTATION=rmw_cyclonedds_cpp·CYCLONEDDS_URI를 두 launch의 additional_env로 주입</w:t>
+            </w:r>
+          </w:p>
+        </w:tc>
+      </w:tr>
+      <w:tr>
+        <w:tc>
+          <w:tcPr>
+            <w:tcW w:type="dxa" w:w="1500"/>
+          </w:tcPr>
+          <w:p>
+            <w:r>
+              <w:t>src/medirun_gui/.../roscamerafeedprovider.cpp·h</w:t>
+            </w:r>
+          </w:p>
+        </w:tc>
+        <w:tc>
+          <w:tcPr>
+            <w:tcW w:type="dxa" w:w="3000"/>
+          </w:tcPr>
+          <w:p>
+            <w:r>
+              <w:t>구독 QoS: rmw_qos_profile_sensor_data 그대로 사용(BEST_EFFORT, depth 5)</w:t>
+            </w:r>
+          </w:p>
+        </w:tc>
+        <w:tc>
+          <w:tcPr>
+            <w:tcW w:type="dxa" w:w="5246"/>
+          </w:tcPr>
+          <w:p>
+            <w:r>
+              <w:t>depth를 1로 낮춰, 밀린 프레임 대신 항상 최신 프레임을 우선하도록 변경</w:t>
+            </w:r>
           </w:p>
         </w:tc>
       </w:tr>
@@ -5144,31 +5009,10 @@
             </w:tcMar>
           </w:tcPr>
           <w:p>
-            <w:pPr>
-              <w:spacing w:after="20" w:line="240"/>
-            </w:pPr>
-            <w:r>
-              <w:rPr>
-                <w:rFonts w:ascii="Consolas" w:cs="Consolas" w:eastAsia="Consolas" w:hAnsi="Consolas"/>
-                <w:color w:val="3C3429"/>
-                <w:sz w:val="16"/>
-                <w:szCs w:val="16"/>
-              </w:rPr>
-              <w:t xml:space="preserve"># 적용 명령</w:t>
-            </w:r>
-          </w:p>
-          <w:p>
-            <w:pPr>
-              <w:spacing w:after="20" w:line="240"/>
-            </w:pPr>
-            <w:r>
-              <w:rPr>
-                <w:rFonts w:ascii="Consolas" w:cs="Consolas" w:eastAsia="Consolas" w:hAnsi="Consolas"/>
-                <w:color w:val="3C3429"/>
-                <w:sz w:val="16"/>
-                <w:szCs w:val="16"/>
-              </w:rPr>
-              <w:t xml:space="preserve">colcon build --packages-select &lt;pkg&gt; --symlink-install</w:t>
+            <w:r>
+              <w:t># 적용 명령</w:t>
+              <w:br/>
+              <w:t>colcon build --symlink-install --packages-select turtlebot3_bringup medirun_gui medirun_bringup</w:t>
             </w:r>
           </w:p>
         </w:tc>
@@ -5207,7 +5051,7 @@
           <w:sz w:val="17"/>
           <w:szCs w:val="17"/>
         </w:rPr>
-        <w:t xml:space="preserve">무엇을 관측해 해결로 판단했는가 (수치·로그·화면)</w:t>
+        <w:t>실제 로봇(Pi)이 살아있는 상태에서 GUI를 새 설정으로 접속시켜 ros2 topic hz/bw로 수신 안정성을, 화면 확대 캡처로 시각적 깨짐 여부를 관측했다. ros2 topic hz 기준 약 30Hz(표준편차 4.5ms 내외), bw 기준 약 1.23~1.25MB/s로 안정 수신되었고, 화면 캡처 3장을 3배 확대해도 블록 깨짐·색 번짐이 없었다. GUI 프로세스 environ에서 CYCLONEDDS_URI·RMW_IMPLEMENTATION 주입도 확인했다.</w:t>
       </w:r>
     </w:p>
     <w:p>
@@ -5226,7 +5070,7 @@
           <w:sz w:val="17"/>
           <w:szCs w:val="17"/>
         </w:rPr>
-        <w:t xml:space="preserve">재현 절차를 다시 수행한 결과와 횟수</w:t>
+        <w:t>한계: 검증 시점에 로봇(Pi) 측 카메라 퍼블리셔는 아직 재빌드 전이었다(퍼블리셔 QoS가 RELIABLE로 관측됨) — 양쪽 모두 새 설정을 적용한 조합에서의 효과는 별도 재확인이 필요하다.</w:t>
       </w:r>
     </w:p>
     <w:p>
@@ -5356,17 +5200,8 @@
             <w:vAlign w:val="center"/>
           </w:tcPr>
           <w:p>
-            <w:pPr>
-              <w:spacing w:after="0" w:before="0" w:line="260"/>
-            </w:pPr>
-            <w:r>
-              <w:rPr>
-                <w:rFonts w:ascii="맑은 고딕" w:cs="맑은 고딕" w:eastAsia="맑은 고딕" w:hAnsi="맑은 고딕"/>
-                <w:color w:val="3C3429"/>
-                <w:sz w:val="17"/>
-                <w:szCs w:val="17"/>
-              </w:rPr>
-              <w:t xml:space="preserve">개발 규칙서 / 체크리스트 / 코드 / 없음</w:t>
+            <w:r>
+              <w:t>코드</w:t>
             </w:r>
           </w:p>
         </w:tc>
@@ -5388,9 +5223,9 @@
             <w:vAlign w:val="center"/>
           </w:tcPr>
           <w:p>
-            <w:pPr>
-              <w:spacing w:after="0" w:before="0" w:line="260"/>
-            </w:pPr>
+            <w:r>
+              <w:t>카메라처럼 큰 메시지를 Wi-Fi로 보낼 때는 DDS 조각 크기를 MTU 이하로 명시 설정(UDP 강제·유니캐스트·구독 depth=1)하는 것을 launch 설정 기본값으로 고정했다.</w:t>
+            </w:r>
           </w:p>
         </w:tc>
       </w:tr>

</xml_diff>